<commit_message>
draft needs descriptive stats and estimated results
</commit_message>
<xml_diff>
--- a/analysis/draft/MinWageHHI_01.docx
+++ b/analysis/draft/MinWageHHI_01.docx
@@ -23,7 +23,7 @@
         <w:pStyle w:val="Date"/>
       </w:pPr>
       <w:r>
-        <w:t xml:space="preserve">January 09, 2026, 11:01 +0900</w:t>
+        <w:t xml:space="preserve">January 21, 2026, 03:01 +0200</w:t>
       </w:r>
     </w:p>
     <w:bookmarkStart w:id="20" w:name="introduction"/>
@@ -36,7 +36,7 @@
       </w:r>
     </w:p>
     <w:bookmarkEnd w:id="20"/>
-    <w:bookmarkStart w:id="25" w:name="X3218d958793b59d1222faf757133db5bf906e41"/>
+    <w:bookmarkStart w:id="28" w:name="X3218d958793b59d1222faf757133db5bf906e41"/>
     <w:p>
       <w:pPr>
         <w:pStyle w:val="Heading1"/>
@@ -45,36 +45,56 @@
         <w:t xml:space="preserve">2. Agricultural minimum wages in South Africa</w:t>
       </w:r>
     </w:p>
+    <w:bookmarkStart w:id="25" w:name="timeline"/>
+    <w:p>
+      <w:pPr>
+        <w:pStyle w:val="Heading2"/>
+      </w:pPr>
+      <w:r>
+        <w:t xml:space="preserve">2.1 Timeline</w:t>
+      </w:r>
+    </w:p>
     <w:p>
       <w:pPr>
         <w:pStyle w:val="FirstParagraph"/>
       </w:pPr>
       <w:r>
-        <w:t xml:space="preserve">Timeline:</w:t>
-      </w:r>
-    </w:p>
-    <w:p>
-      <w:pPr>
-        <w:pStyle w:val="BodyText"/>
-      </w:pPr>
-      <w:r>
-        <w:t xml:space="preserve">Minimum wage was introduced in South Africa’s the agricultural sector in 2003. In the same year, the share of agriculture in employment was 18.9% which declined steadily to 16.1% in 2012 (</w:t>
+        <w:t xml:space="preserve">Minimum wage was introduced in South Africa’s the agricultural sector in 2003. In the same year, the share of agriculture in employment was 6.83%</w:t>
+      </w:r>
+      <w:r>
+        <w:t xml:space="preserve"> </w:t>
       </w:r>
       <w:hyperlink r:id="rId21">
         <w:r>
           <w:rPr>
             <w:rStyle w:val="Hyperlink"/>
           </w:rPr>
-          <w:t xml:space="preserve">SL.AGR.EMPL.ZS</w:t>
+          <w:t xml:space="preserve">LFS March 2003</w:t>
         </w:r>
       </w:hyperlink>
       <w:r>
-        <w:t xml:space="preserve"> </w:t>
-      </w:r>
-      <w:r>
-        <w:t xml:space="preserve">of World Bank Development Indicators). It employs over 900,000 workers out of 25 million of labour force, or 3.67%, or 5.39% of formal and informal employment in 2025 (</w:t>
+        <w:t xml:space="preserve">. By 2012, 5.05%</w:t>
+      </w:r>
+      <w:r>
+        <w:t xml:space="preserve"> </w:t>
       </w:r>
       <w:hyperlink r:id="rId22">
+        <w:r>
+          <w:rPr>
+            <w:rStyle w:val="Hyperlink"/>
+          </w:rPr>
+          <w:t xml:space="preserve">LFS Q4, 2012</w:t>
+        </w:r>
+      </w:hyperlink>
+    </w:p>
+    <w:p>
+      <w:pPr>
+        <w:pStyle w:val="BodyText"/>
+      </w:pPr>
+      <w:r>
+        <w:t xml:space="preserve">It employs over 900,000 workers out of 25 million of labour force, or 3.67%, or 5.39% of formal and informal employment in 2025 (</w:t>
+      </w:r>
+      <w:hyperlink r:id="rId23">
         <w:r>
           <w:rPr>
             <w:rStyle w:val="Hyperlink"/>
@@ -89,7 +109,7 @@
         <w:rPr>
           <w:rStyle w:val="FootnoteReference"/>
         </w:rPr>
-        <w:footnoteReference w:id="23"/>
+        <w:footnoteReference w:id="24"/>
       </w:r>
       <w:r>
         <w:t xml:space="preserve"> </w:t>
@@ -103,23 +123,25 @@
         <w:pStyle w:val="BodyText"/>
       </w:pPr>
       <w:r>
-        <w:t xml:space="preserve">Initially, there were two minimum wage rates applied to semi-rural and rural areas, which were later unified in 2008. After the unification, it was mandated in the law that the minimum wage will adjust for inflation. Nevertheless, the adjustments were held incomplete in the semi-rural areas due to preparations for minimum wage unification, which was intended to slow down the catch up process in the rural areas to the semi-rural areas. This resulted in reduction in real minimum wage in semi-rural areas. This eventually gave rise to the farm worker’s protests in November, 2012. In March 2013, the minimum wage rate was increased by 52% (R69 to R105 a day).</w:t>
-      </w:r>
-    </w:p>
-    <w:p>
-      <w:pPr>
-        <w:pStyle w:val="BodyText"/>
-      </w:pPr>
-      <w:r>
-        <w:t xml:space="preserve">Compliance:</w:t>
-      </w:r>
-    </w:p>
-    <w:p>
-      <w:pPr>
-        <w:pStyle w:val="BodyText"/>
-      </w:pPr>
-      <w:r>
-        <w:t xml:space="preserve">It is argued that the compliance to the minimum wage law is incomplete in South Africa</w:t>
+        <w:t xml:space="preserve">Due to the difference in living costs, there were two minimum wage rates applied to semi-rural and rural areas, which were later unified in 2008. At the introduction in 2003, it was mandated in the law that the minimum wage will adjust for inflation. Nevertheless, the adjustments were held incomplete in the semi-rural areas due to preparations for minimum wage unification, which was intended to slow down the catch up process of the rural areas to the semi-rural areas. The slower rate of inflation adjustments resulted in reduction of real minimum wage in semi-rural areas. This eventually gave rise to the farm worker’s protests in November, 2012. In March 2013, the minimum wage rate was increased by 52% (R69 to R105 a day). The unignorable magnitude of the increase made the firms to undertake adjustment in production. The magnitude of this size gives researchers a ground to test employment impacts of minimum wages.</w:t>
+      </w:r>
+    </w:p>
+    <w:bookmarkEnd w:id="25"/>
+    <w:bookmarkStart w:id="27" w:name="compliance"/>
+    <w:p>
+      <w:pPr>
+        <w:pStyle w:val="Heading2"/>
+      </w:pPr>
+      <w:r>
+        <w:t xml:space="preserve">2.2 Compliance</w:t>
+      </w:r>
+    </w:p>
+    <w:p>
+      <w:pPr>
+        <w:pStyle w:val="FirstParagraph"/>
+      </w:pPr>
+      <w:r>
+        <w:t xml:space="preserve">The case for impact estimation of policy shocks rings horrow if the minimum wage was not enforced. It is argued that the compliance to the minimum wage law is incomplete in South Africa</w:t>
       </w:r>
       <w:r>
         <w:t xml:space="preserve"> </w:t>
@@ -173,10 +195,10 @@
         <w:rPr>
           <w:rStyle w:val="FootnoteReference"/>
         </w:rPr>
-        <w:footnoteReference w:id="24"/>
-      </w:r>
-      <w:r>
-        <w:t xml:space="preserve">. Given the incomplete compliance, we interpret the estimated results as an ITT (intention-to-treat) estimates. It has been shown that the compliance rates are rising through time in a five year period window</w:t>
+        <w:footnoteReference w:id="26"/>
+      </w:r>
+      <w:r>
+        <w:t xml:space="preserve">. Given the incomplete compliance, we interpret the estimated results as an intention-to-treat (ITT) estimates. It has been shown that the compliance rates are rising through time in a five year period window</w:t>
       </w:r>
       <w:r>
         <w:t xml:space="preserve"> </w:t>
@@ -196,11 +218,12 @@
         <w:t xml:space="preserve">)</w:t>
       </w:r>
       <w:r>
-        <w:t xml:space="preserve">, which requires us to use the similar time horizon in estimating the impacts.</w:t>
-      </w:r>
-    </w:p>
-    <w:bookmarkEnd w:id="25"/>
-    <w:bookmarkStart w:id="28" w:name="previous-literature"/>
+        <w:t xml:space="preserve">, which informs us to use the similar time horizon in estimating the impacts.</w:t>
+      </w:r>
+    </w:p>
+    <w:bookmarkEnd w:id="27"/>
+    <w:bookmarkEnd w:id="28"/>
+    <w:bookmarkStart w:id="31" w:name="previous-literature"/>
     <w:p>
       <w:pPr>
         <w:pStyle w:val="Heading1"/>
@@ -330,7 +353,7 @@
         <w:rPr>
           <w:rStyle w:val="FootnoteReference"/>
         </w:rPr>
-        <w:footnoteReference w:id="26"/>
+        <w:footnoteReference w:id="29"/>
       </w:r>
       <w:r>
         <w:t xml:space="preserve"> </w:t>
@@ -373,7 +396,7 @@
         <w:t xml:space="preserve"> </w:t>
       </w:r>
       <w:r>
-        <w:t xml:space="preserve">are the first to examine this channel and use online labour market data of stock clerks, retail salespersons, and cashiers in the US. They find that HHI softens the possible unemployment impacts of minimum wages.</w:t>
+        <w:t xml:space="preserve">are the first to examine this channel and use online labour market data of stock clerks, retail salespersons, and cashiers in the US. They find that labour market concentration as measured by Harhindahl-Hirschman Index (HHI) reduces the possible unemployment impacts of minimum wages.</w:t>
       </w:r>
     </w:p>
     <w:p>
@@ -407,13 +430,13 @@
         <w:rPr>
           <w:rStyle w:val="FootnoteReference"/>
         </w:rPr>
-        <w:footnoteReference w:id="27"/>
-      </w:r>
-      <w:r>
-        <w:t xml:space="preserve"> </w:t>
-      </w:r>
-      <w:r>
-        <w:t xml:space="preserve">Some studies use the different changes in minimum wages by region in 2008 to estimate the impacts. However, The estimates turned out to be noisy due possibly to a relatively small increase in minimum wages which may have led to low statistical power</w:t>
+        <w:footnoteReference w:id="30"/>
+      </w:r>
+      <w:r>
+        <w:t xml:space="preserve"> </w:t>
+      </w:r>
+      <w:r>
+        <w:t xml:space="preserve">Some studies use the different changes in minimum wages by region in 2008 to estimate the impacts. However, the estimates turned out to be noisy due possibly to a relatively small increase in minimum wages that provides only modest statistical power</w:t>
       </w:r>
       <w:r>
         <w:t xml:space="preserve"> </w:t>
@@ -450,8 +473,8 @@
         <w:t xml:space="preserve">. In the current study, we use the large increase in minimum wages in 2012 to estimate the impacts of minimum wages on employment and the possible mitigating factor of labour market power.</w:t>
       </w:r>
     </w:p>
-    <w:bookmarkEnd w:id="28"/>
-    <w:bookmarkStart w:id="34" w:name="monopsony-and-unemployent-impacts"/>
+    <w:bookmarkEnd w:id="31"/>
+    <w:bookmarkStart w:id="37" w:name="monopsony-and-unemployent-impacts"/>
     <w:p>
       <w:pPr>
         <w:pStyle w:val="Heading1"/>
@@ -513,7 +536,7 @@
         <w:t xml:space="preserve">The minimum wage for a monopsonist effectively transforms an upward sloping labour supply curve to a horizontal line. When the minimum wage is set lower than the competitive wage at the competitive employment level, it can result in an increased level of employment. In reality, marginal revenue curves differ across firms and there is an additional pressure on firms through competition between firms on the labour demand side, which dilute the positive employment response. Firms with low marginal revenue curves may exit the market. The end result is thus either negative or positive, while the scale of the impact may be muted from the pure competitive case or the pure monopsonist case.</w:t>
       </w:r>
     </w:p>
-    <w:bookmarkStart w:id="33" w:name="sec-monopsonist"/>
+    <w:bookmarkStart w:id="36" w:name="sec-monopsonist"/>
     <w:p>
       <w:pPr>
         <w:pStyle w:val="Heading2"/>
@@ -535,7 +558,7 @@
       <w:tr>
         <w:tc>
           <w:tcPr/>
-          <w:bookmarkStart w:id="32" w:name="fig-Fig1"/>
+          <w:bookmarkStart w:id="35" w:name="fig-Fig1"/>
           <w:p>
             <w:pPr>
               <w:pStyle w:val="Compact"/>
@@ -546,18 +569,18 @@
                 <wp:inline>
                   <wp:extent cx="4267200" cy="2931053"/>
                   <wp:effectExtent b="0" l="0" r="0" t="0"/>
-                  <wp:docPr descr="" title="" id="30" name="Picture"/>
+                  <wp:docPr descr="" title="" id="33" name="Picture"/>
                   <a:graphic>
                     <a:graphicData uri="http://schemas.openxmlformats.org/drawingml/2006/picture">
                       <pic:pic>
                         <pic:nvPicPr>
-                          <pic:cNvPr descr="Fig1.jpg" id="31" name="Picture"/>
+                          <pic:cNvPr descr="Fig1.jpg" id="34" name="Picture"/>
                           <pic:cNvPicPr>
                             <a:picLocks noChangeArrowheads="1" noChangeAspect="1"/>
                           </pic:cNvPicPr>
                         </pic:nvPicPr>
                         <pic:blipFill>
-                          <a:blip r:embed="rId29"/>
+                          <a:blip r:embed="rId32"/>
                           <a:stretch>
                             <a:fillRect/>
                           </a:stretch>
@@ -597,7 +620,7 @@
               <w:t xml:space="preserve">Figure 1: Monopsonist responses to a minimum wage</w:t>
             </w:r>
           </w:p>
-          <w:bookmarkEnd w:id="32"/>
+          <w:bookmarkEnd w:id="35"/>
         </w:tc>
       </w:tr>
     </w:tbl>
@@ -871,9 +894,9 @@
         <w:t xml:space="preserve">.</w:t>
       </w:r>
     </w:p>
-    <w:bookmarkEnd w:id="33"/>
-    <w:bookmarkEnd w:id="34"/>
-    <w:bookmarkStart w:id="40" w:name="data"/>
+    <w:bookmarkEnd w:id="36"/>
+    <w:bookmarkEnd w:id="37"/>
+    <w:bookmarkStart w:id="43" w:name="data"/>
     <w:p>
       <w:pPr>
         <w:pStyle w:val="Heading1"/>
@@ -882,7 +905,7 @@
         <w:t xml:space="preserve">5. Data</w:t>
       </w:r>
     </w:p>
-    <w:bookmarkStart w:id="35" w:name="sampling-frame-of-cit-irp5-data-set"/>
+    <w:bookmarkStart w:id="38" w:name="sampling-frame-of-cit-irp5-data-set"/>
     <w:p>
       <w:pPr>
         <w:pStyle w:val="Heading2"/>
@@ -891,8 +914,8 @@
         <w:t xml:space="preserve">5.1 Sampling frame of CIT-IRP5 data set</w:t>
       </w:r>
     </w:p>
-    <w:bookmarkEnd w:id="35"/>
-    <w:bookmarkStart w:id="36" w:name="hhi"/>
+    <w:bookmarkEnd w:id="38"/>
+    <w:bookmarkStart w:id="39" w:name="hhi"/>
     <w:p>
       <w:pPr>
         <w:pStyle w:val="Heading2"/>
@@ -906,7 +929,7 @@
         <w:pStyle w:val="FirstParagraph"/>
       </w:pPr>
       <w:r>
-        <w:t xml:space="preserve">We count the number of employees in establishments and construct HHI in the respetive regional labour markets. SARS contain information at the establishment level. Given that we use IDs of firms that report to SARS, we can identify the firm branches up to the level of granularity in geographical information. The levels, from the most to the least granular, are Main Place, Local Municipality, District Municipality, and Province. We will use the least three granular levels in defining HHI.</w:t>
+        <w:t xml:space="preserve">We count the number of employees at the establishment level and construct HHI in the respetive regional labour markets. Firms use corporate tax IDs when they report income taxes to SARS. Firms also report their employee incomes to SARS with individual tax IDs and corporate tax IDs. SARS data are thus a merged employer-employee (MEE) data set.</w:t>
       </w:r>
     </w:p>
     <w:p>
@@ -914,7 +937,7 @@
         <w:pStyle w:val="BodyText"/>
       </w:pPr>
       <w:r>
-        <w:t xml:space="preserve">In the CIT-IRP5 data set, all the employee information is linked to the head quarter branch, not the actual establishment they work at. So one needs to allocate the number of workers across establishments in a firm. We use establishment revenues in 2011 as weights. The advantage of this approach is that the sample size is retained. The disadvantage is we lose characteristics of individuals such as age or gender, and we can use such characteristics only at the firm level. An alternative approach we can take is to aggregate establishments and measure impacts at the firm level. The advantage is that we can use the individual characteristics of workers. The disadvantage is we lose establishment level variations and end up in smaller sample size. The former approach has a better chance of detecting the impacts due to stronger statistical power. The latter approach has a better chance of interpreting the impacts due to more detailed information of workers. Therefore, we will use both approaches.</w:t>
+        <w:t xml:space="preserve">Firms report each establishments’ geographical information. We can identify the firm branches up to the level of granularity in geographical information. The levels, from the most to the least granular, are Main Place, Local Municipality, District Municipality, and Province. We will use the least granular levels, Main Place, Local Municipality, and District Municipality, in defining HHI.</w:t>
       </w:r>
     </w:p>
     <w:p>
@@ -922,11 +945,19 @@
         <w:pStyle w:val="BodyText"/>
       </w:pPr>
       <w:r>
+        <w:t xml:space="preserve">IRP5, the individual income tax data set, contains corporate tax IDs and geographical information of their employers. In the current version (version 5) of data, however, merged (MEE) data set links all employees to the head quarter branch due to the limitation in the granularity of geographical information incorporated in the data. SARS MEE data (CIT-IRP5) is potent to identify exact branches of respective employees, yet its incorporation into the data set is scheduled in the future. We thus use the indivudual tax returns data IRP5 and its geographical information to measure employment over space and time.</w:t>
+      </w:r>
+    </w:p>
+    <w:p>
+      <w:pPr>
+        <w:pStyle w:val="BodyText"/>
+      </w:pPr>
+      <w:r>
         <w:t xml:space="preserve">Distributions of HHIs at various geographical levels are shown in Figure X.</w:t>
       </w:r>
     </w:p>
-    <w:bookmarkEnd w:id="36"/>
-    <w:bookmarkStart w:id="39" w:name="employment-trends"/>
+    <w:bookmarkEnd w:id="39"/>
+    <w:bookmarkStart w:id="42" w:name="employment-trends"/>
     <w:p>
       <w:pPr>
         <w:pStyle w:val="Heading2"/>
@@ -946,7 +977,7 @@
         <w:rPr>
           <w:rStyle w:val="FootnoteReference"/>
         </w:rPr>
-        <w:footnoteReference w:id="37"/>
+        <w:footnoteReference w:id="40"/>
       </w:r>
       <w:r>
         <w:t xml:space="preserve"> </w:t>
@@ -963,9 +994,33 @@
         <w:t xml:space="preserve">There are Y workers listed in 2012.</w:t>
       </w:r>
     </w:p>
-    <w:bookmarkEnd w:id="39"/>
-    <w:bookmarkEnd w:id="40"/>
-    <w:bookmarkStart w:id="44" w:name="estimation-strategy"/>
+    <w:p>
+      <w:pPr>
+        <w:pStyle w:val="Compact"/>
+        <w:numPr>
+          <w:ilvl w:val="0"/>
+          <w:numId w:val="1001"/>
+        </w:numPr>
+      </w:pPr>
+      <w:r>
+        <w:t xml:space="preserve">Employment trends in agricture, in aggregate economy</w:t>
+      </w:r>
+    </w:p>
+    <w:p>
+      <w:pPr>
+        <w:pStyle w:val="Compact"/>
+        <w:numPr>
+          <w:ilvl w:val="0"/>
+          <w:numId w:val="1001"/>
+        </w:numPr>
+      </w:pPr>
+      <w:r>
+        <w:t xml:space="preserve">Measured HHI trends in aggreculture, in aggregate economy</w:t>
+      </w:r>
+    </w:p>
+    <w:bookmarkEnd w:id="42"/>
+    <w:bookmarkEnd w:id="43"/>
+    <w:bookmarkStart w:id="47" w:name="estimation-strategy"/>
     <w:p>
       <w:pPr>
         <w:pStyle w:val="Heading1"/>
@@ -1137,7 +1192,7 @@
         <w:t xml:space="preserve"> </w:t>
       </w:r>
       <w:r>
-        <w:t xml:space="preserve">is Harfindahl-Hirschman Index of employment in region</w:t>
+        <w:t xml:space="preserve">is HHI of employment in region</w:t>
       </w:r>
       <w:r>
         <w:t xml:space="preserve"> </w:t>
@@ -1519,7 +1574,7 @@
         <w:rPr>
           <w:rStyle w:val="FootnoteReference"/>
         </w:rPr>
-        <w:footnoteReference w:id="41"/>
+        <w:footnoteReference w:id="44"/>
       </w:r>
       <w:r>
         <w:t xml:space="preserve">. They also caution against using the two-way fixed effect specification, because the dose</w:t>
@@ -1620,7 +1675,7 @@
         <w:rPr>
           <w:rStyle w:val="FootnoteReference"/>
         </w:rPr>
-        <w:footnoteReference w:id="42"/>
+        <w:footnoteReference w:id="45"/>
       </w:r>
       <w:r>
         <w:t xml:space="preserve">. This is to assume the regional labour markets are integrated at the sic-7’s 1 digit (broadly defined agriculture industry) level, estimating the parameters at the broadly defined agriculture industry level by dropping</w:t>
@@ -1654,14 +1709,14 @@
         <w:rPr>
           <w:rStyle w:val="FootnoteReference"/>
         </w:rPr>
-        <w:footnoteReference w:id="43"/>
-      </w:r>
-      <w:r>
-        <w:t xml:space="preserve"> </w:t>
-      </w:r>
-    </w:p>
-    <w:bookmarkEnd w:id="44"/>
-    <w:bookmarkStart w:id="47" w:name="results"/>
+        <w:footnoteReference w:id="46"/>
+      </w:r>
+      <w:r>
+        <w:t xml:space="preserve"> </w:t>
+      </w:r>
+    </w:p>
+    <w:bookmarkEnd w:id="47"/>
+    <w:bookmarkStart w:id="50" w:name="results"/>
     <w:p>
       <w:pPr>
         <w:pStyle w:val="Heading1"/>
@@ -1670,7 +1725,7 @@
         <w:t xml:space="preserve">7. Results</w:t>
       </w:r>
     </w:p>
-    <w:bookmarkStart w:id="45" w:name="main-results"/>
+    <w:bookmarkStart w:id="48" w:name="main-results"/>
     <w:p>
       <w:pPr>
         <w:pStyle w:val="Heading2"/>
@@ -1679,8 +1734,8 @@
         <w:t xml:space="preserve">7.1 Main results</w:t>
       </w:r>
     </w:p>
-    <w:bookmarkEnd w:id="45"/>
-    <w:bookmarkStart w:id="46" w:name="robustness-checks"/>
+    <w:bookmarkEnd w:id="48"/>
+    <w:bookmarkStart w:id="49" w:name="robustness-checks"/>
     <w:p>
       <w:pPr>
         <w:pStyle w:val="Heading2"/>
@@ -1689,9 +1744,9 @@
         <w:t xml:space="preserve">7.2 Robustness checks</w:t>
       </w:r>
     </w:p>
-    <w:bookmarkEnd w:id="46"/>
-    <w:bookmarkEnd w:id="47"/>
-    <w:bookmarkStart w:id="78" w:name="conclusion"/>
+    <w:bookmarkEnd w:id="49"/>
+    <w:bookmarkEnd w:id="50"/>
+    <w:bookmarkStart w:id="81" w:name="conclusion"/>
     <w:p>
       <w:pPr>
         <w:pStyle w:val="Heading1"/>
@@ -1700,8 +1755,8 @@
         <w:t xml:space="preserve">8. Conclusion</w:t>
       </w:r>
     </w:p>
-    <w:bookmarkStart w:id="77" w:name="refs"/>
-    <w:bookmarkStart w:id="49" w:name="ref-Azaretal2023"/>
+    <w:bookmarkStart w:id="80" w:name="refs"/>
+    <w:bookmarkStart w:id="52" w:name="ref-Azaretal2023"/>
     <w:p>
       <w:pPr>
         <w:pStyle w:val="Bibliography"/>
@@ -1740,7 +1795,7 @@
       <w:r>
         <w:t xml:space="preserve"> </w:t>
       </w:r>
-      <w:hyperlink r:id="rId48">
+      <w:hyperlink r:id="rId51">
         <w:r>
           <w:rPr>
             <w:rStyle w:val="Hyperlink"/>
@@ -1752,8 +1807,8 @@
         <w:t xml:space="preserve">.</w:t>
       </w:r>
     </w:p>
-    <w:bookmarkEnd w:id="49"/>
-    <w:bookmarkStart w:id="50" w:name="ref-BhaskarManningTo2002"/>
+    <w:bookmarkEnd w:id="52"/>
+    <w:bookmarkStart w:id="53" w:name="ref-BhaskarManningTo2002"/>
     <w:p>
       <w:pPr>
         <w:pStyle w:val="Bibliography"/>
@@ -1784,8 +1839,8 @@
         <w:t xml:space="preserve">16 (2): 155–74.</w:t>
       </w:r>
     </w:p>
-    <w:bookmarkEnd w:id="50"/>
-    <w:bookmarkStart w:id="52" w:name="ref-Bhorat2012"/>
+    <w:bookmarkEnd w:id="53"/>
+    <w:bookmarkStart w:id="55" w:name="ref-Bhorat2012"/>
     <w:p>
       <w:pPr>
         <w:pStyle w:val="Bibliography"/>
@@ -1815,7 +1870,7 @@
       <w:r>
         <w:t xml:space="preserve">151 (3): 277–87. https://doi.org/</w:t>
       </w:r>
-      <w:hyperlink r:id="rId51">
+      <w:hyperlink r:id="rId54">
         <w:r>
           <w:rPr>
             <w:rStyle w:val="Hyperlink"/>
@@ -1827,8 +1882,8 @@
         <w:t xml:space="preserve">.</w:t>
       </w:r>
     </w:p>
-    <w:bookmarkEnd w:id="52"/>
-    <w:bookmarkStart w:id="54" w:name="ref-BhoratKanburStanwix2014"/>
+    <w:bookmarkEnd w:id="55"/>
+    <w:bookmarkStart w:id="57" w:name="ref-BhoratKanburStanwix2014"/>
     <w:p>
       <w:pPr>
         <w:pStyle w:val="Bibliography"/>
@@ -1861,7 +1916,7 @@
       <w:r>
         <w:t xml:space="preserve"> </w:t>
       </w:r>
-      <w:hyperlink r:id="rId53">
+      <w:hyperlink r:id="rId56">
         <w:r>
           <w:rPr>
             <w:rStyle w:val="Hyperlink"/>
@@ -1873,8 +1928,8 @@
         <w:t xml:space="preserve">.</w:t>
       </w:r>
     </w:p>
-    <w:bookmarkEnd w:id="54"/>
-    <w:bookmarkStart w:id="56" w:name="ref-Bhorat2015"/>
+    <w:bookmarkEnd w:id="57"/>
+    <w:bookmarkStart w:id="59" w:name="ref-Bhorat2015"/>
     <w:p>
       <w:pPr>
         <w:pStyle w:val="Bibliography"/>
@@ -1907,7 +1962,7 @@
       <w:r>
         <w:t xml:space="preserve"> </w:t>
       </w:r>
-      <w:hyperlink r:id="rId55">
+      <w:hyperlink r:id="rId58">
         <w:r>
           <w:rPr>
             <w:rStyle w:val="Hyperlink"/>
@@ -1919,8 +1974,8 @@
         <w:t xml:space="preserve">.</w:t>
       </w:r>
     </w:p>
-    <w:bookmarkEnd w:id="56"/>
-    <w:bookmarkStart w:id="58" w:name="ref-Callawayetal2025"/>
+    <w:bookmarkEnd w:id="59"/>
+    <w:bookmarkStart w:id="61" w:name="ref-Callawayetal2025"/>
     <w:p>
       <w:pPr>
         <w:pStyle w:val="Bibliography"/>
@@ -1937,7 +1992,7 @@
       <w:r>
         <w:t xml:space="preserve"> </w:t>
       </w:r>
-      <w:hyperlink r:id="rId57">
+      <w:hyperlink r:id="rId60">
         <w:r>
           <w:rPr>
             <w:rStyle w:val="Hyperlink"/>
@@ -1949,8 +2004,8 @@
         <w:t xml:space="preserve">.</w:t>
       </w:r>
     </w:p>
-    <w:bookmarkEnd w:id="58"/>
-    <w:bookmarkStart w:id="60" w:name="ref-DubeLindner2024"/>
+    <w:bookmarkEnd w:id="61"/>
+    <w:bookmarkStart w:id="63" w:name="ref-DubeLindner2024"/>
     <w:p>
       <w:pPr>
         <w:pStyle w:val="Bibliography"/>
@@ -1973,7 +2028,7 @@
       <w:r>
         <w:t xml:space="preserve"> </w:t>
       </w:r>
-      <w:hyperlink r:id="rId59">
+      <w:hyperlink r:id="rId62">
         <w:r>
           <w:rPr>
             <w:rStyle w:val="Hyperlink"/>
@@ -1985,8 +2040,8 @@
         <w:t xml:space="preserve">.</w:t>
       </w:r>
     </w:p>
-    <w:bookmarkEnd w:id="60"/>
-    <w:bookmarkStart w:id="62" w:name="ref-ChrisRulofRankin2015"/>
+    <w:bookmarkEnd w:id="63"/>
+    <w:bookmarkStart w:id="65" w:name="ref-ChrisRulofRankin2015"/>
     <w:p>
       <w:pPr>
         <w:pStyle w:val="Bibliography"/>
@@ -2016,7 +2071,7 @@
       <w:r>
         <w:t xml:space="preserve"> </w:t>
       </w:r>
-      <w:hyperlink r:id="rId61">
+      <w:hyperlink r:id="rId64">
         <w:r>
           <w:rPr>
             <w:rStyle w:val="Hyperlink"/>
@@ -2028,8 +2083,8 @@
         <w:t xml:space="preserve">.</w:t>
       </w:r>
     </w:p>
-    <w:bookmarkEnd w:id="62"/>
-    <w:bookmarkStart w:id="63" w:name="ref-HarasztosiLindner2019"/>
+    <w:bookmarkEnd w:id="65"/>
+    <w:bookmarkStart w:id="66" w:name="ref-HarasztosiLindner2019"/>
     <w:p>
       <w:pPr>
         <w:pStyle w:val="Bibliography"/>
@@ -2060,8 +2115,8 @@
         <w:t xml:space="preserve">109 (8): 2693–2727.</w:t>
       </w:r>
     </w:p>
-    <w:bookmarkEnd w:id="63"/>
-    <w:bookmarkStart w:id="65" w:name="ref-Horton2025"/>
+    <w:bookmarkEnd w:id="66"/>
+    <w:bookmarkStart w:id="68" w:name="ref-Horton2025"/>
     <w:p>
       <w:pPr>
         <w:pStyle w:val="Bibliography"/>
@@ -2094,7 +2149,7 @@
       <w:r>
         <w:t xml:space="preserve"> </w:t>
       </w:r>
-      <w:hyperlink r:id="rId64">
+      <w:hyperlink r:id="rId67">
         <w:r>
           <w:rPr>
             <w:rStyle w:val="Hyperlink"/>
@@ -2106,8 +2161,8 @@
         <w:t xml:space="preserve">.</w:t>
       </w:r>
     </w:p>
-    <w:bookmarkEnd w:id="65"/>
-    <w:bookmarkStart w:id="67" w:name="ref-ItoSeiro2021e"/>
+    <w:bookmarkEnd w:id="68"/>
+    <w:bookmarkStart w:id="70" w:name="ref-ItoSeiro2021e"/>
     <w:p>
       <w:pPr>
         <w:pStyle w:val="Bibliography"/>
@@ -2148,7 +2203,7 @@
       <w:r>
         <w:t xml:space="preserve"> </w:t>
       </w:r>
-      <w:hyperlink r:id="rId66">
+      <w:hyperlink r:id="rId69">
         <w:r>
           <w:rPr>
             <w:rStyle w:val="Hyperlink"/>
@@ -2160,8 +2215,8 @@
         <w:t xml:space="preserve">.</w:t>
       </w:r>
     </w:p>
-    <w:bookmarkEnd w:id="67"/>
-    <w:bookmarkStart w:id="69" w:name="ref-MaCurdy2015"/>
+    <w:bookmarkEnd w:id="70"/>
+    <w:bookmarkStart w:id="72" w:name="ref-MaCurdy2015"/>
     <w:p>
       <w:pPr>
         <w:pStyle w:val="Bibliography"/>
@@ -2194,7 +2249,7 @@
       <w:r>
         <w:t xml:space="preserve"> </w:t>
       </w:r>
-      <w:hyperlink r:id="rId68">
+      <w:hyperlink r:id="rId71">
         <w:r>
           <w:rPr>
             <w:rStyle w:val="Hyperlink"/>
@@ -2206,8 +2261,8 @@
         <w:t xml:space="preserve">.</w:t>
       </w:r>
     </w:p>
-    <w:bookmarkEnd w:id="69"/>
-    <w:bookmarkStart w:id="70" w:name="ref-Manning2013"/>
+    <w:bookmarkEnd w:id="72"/>
+    <w:bookmarkStart w:id="73" w:name="ref-Manning2013"/>
     <w:p>
       <w:pPr>
         <w:pStyle w:val="Bibliography"/>
@@ -2229,8 +2284,8 @@
         <w:t xml:space="preserve">. Princeton University Press.</w:t>
       </w:r>
     </w:p>
-    <w:bookmarkEnd w:id="70"/>
-    <w:bookmarkStart w:id="72" w:name="ref-Manning2021ILRreview"/>
+    <w:bookmarkEnd w:id="73"/>
+    <w:bookmarkStart w:id="75" w:name="ref-Manning2021ILRreview"/>
     <w:p>
       <w:pPr>
         <w:pStyle w:val="Bibliography"/>
@@ -2263,7 +2318,7 @@
       <w:r>
         <w:t xml:space="preserve"> </w:t>
       </w:r>
-      <w:hyperlink r:id="rId71">
+      <w:hyperlink r:id="rId74">
         <w:r>
           <w:rPr>
             <w:rStyle w:val="Hyperlink"/>
@@ -2275,8 +2330,8 @@
         <w:t xml:space="preserve">.</w:t>
       </w:r>
     </w:p>
-    <w:bookmarkEnd w:id="72"/>
-    <w:bookmarkStart w:id="73" w:name="ref-Manning2021"/>
+    <w:bookmarkEnd w:id="75"/>
+    <w:bookmarkStart w:id="76" w:name="ref-Manning2021"/>
     <w:p>
       <w:pPr>
         <w:pStyle w:val="Bibliography"/>
@@ -2304,8 +2359,8 @@
         <w:t xml:space="preserve">.</w:t>
       </w:r>
     </w:p>
-    <w:bookmarkEnd w:id="73"/>
-    <w:bookmarkStart w:id="75" w:name="ref-Uma2013"/>
+    <w:bookmarkEnd w:id="76"/>
+    <w:bookmarkStart w:id="78" w:name="ref-Uma2013"/>
     <w:p>
       <w:pPr>
         <w:pStyle w:val="Bibliography"/>
@@ -2338,7 +2393,7 @@
       <w:r>
         <w:t xml:space="preserve"> </w:t>
       </w:r>
-      <w:hyperlink r:id="rId74">
+      <w:hyperlink r:id="rId77">
         <w:r>
           <w:rPr>
             <w:rStyle w:val="Hyperlink"/>
@@ -2350,8 +2405,8 @@
         <w:t xml:space="preserve">.</w:t>
       </w:r>
     </w:p>
-    <w:bookmarkEnd w:id="75"/>
-    <w:bookmarkStart w:id="76" w:name="ref-Robinson1933"/>
+    <w:bookmarkEnd w:id="78"/>
+    <w:bookmarkStart w:id="79" w:name="ref-Robinson1933"/>
     <w:p>
       <w:pPr>
         <w:pStyle w:val="Bibliography"/>
@@ -2373,9 +2428,9 @@
         <w:t xml:space="preserve">. London: Mcmillan.</w:t>
       </w:r>
     </w:p>
-    <w:bookmarkEnd w:id="76"/>
-    <w:bookmarkEnd w:id="77"/>
-    <w:bookmarkEnd w:id="78"/>
+    <w:bookmarkEnd w:id="79"/>
+    <w:bookmarkEnd w:id="80"/>
+    <w:bookmarkEnd w:id="81"/>
     <w:sectPr>
       <w:footnotePr>
         <w:numRestart w:val="eachSect"/>
@@ -2405,7 +2460,7 @@
       </w:r>
     </w:p>
   </w:footnote>
-  <w:footnote w:id="23">
+  <w:footnote w:id="24">
     <w:p>
       <w:pPr>
         <w:pStyle w:val="FootnoteText"/>
@@ -2427,7 +2482,7 @@
       </w:r>
     </w:p>
   </w:footnote>
-  <w:footnote w:id="24">
+  <w:footnote w:id="26">
     <w:p>
       <w:pPr>
         <w:pStyle w:val="FootnoteText"/>
@@ -2449,7 +2504,7 @@
       </w:r>
     </w:p>
   </w:footnote>
-  <w:footnote w:id="26">
+  <w:footnote w:id="29">
     <w:p>
       <w:pPr>
         <w:pStyle w:val="FootnoteText"/>
@@ -2471,7 +2526,7 @@
       </w:r>
     </w:p>
   </w:footnote>
-  <w:footnote w:id="27">
+  <w:footnote w:id="30">
     <w:p>
       <w:pPr>
         <w:pStyle w:val="FootnoteText"/>
@@ -2493,7 +2548,7 @@
       </w:r>
     </w:p>
   </w:footnote>
-  <w:footnote w:id="37">
+  <w:footnote w:id="40">
     <w:p>
       <w:pPr>
         <w:pStyle w:val="FootnoteText"/>
@@ -2513,7 +2568,7 @@
       <w:r>
         <w:t xml:space="preserve"> </w:t>
       </w:r>
-      <w:hyperlink r:id="rId38">
+      <w:hyperlink r:id="rId41">
         <w:r>
           <w:rPr>
             <w:rStyle w:val="Hyperlink"/>
@@ -2529,7 +2584,7 @@
       </w:r>
     </w:p>
   </w:footnote>
-  <w:footnote w:id="41">
+  <w:footnote w:id="44">
     <w:p>
       <w:pPr>
         <w:pStyle w:val="FootnoteText"/>
@@ -2551,7 +2606,7 @@
       </w:r>
     </w:p>
   </w:footnote>
-  <w:footnote w:id="42">
+  <w:footnote w:id="45">
     <w:p>
       <w:pPr>
         <w:pStyle w:val="FootnoteText"/>
@@ -2604,7 +2659,7 @@
       </w:r>
     </w:p>
   </w:footnote>
-  <w:footnote w:id="43">
+  <w:footnote w:id="46">
     <w:p>
       <w:pPr>
         <w:pStyle w:val="FootnoteText"/>
@@ -2724,8 +2779,114 @@
       </w:pPr>
     </w:lvl>
   </w:abstractNum>
+  <w:abstractNum w:abstractNumId="991">
+    <w:nsid w:val="0000A991"/>
+    <w:multiLevelType w:val="multilevel"/>
+    <w:lvl w:ilvl="0">
+      <w:numFmt w:val="bullet"/>
+      <w:lvlText w:val=""/>
+      <w:lvlJc w:val="left"/>
+      <w:pPr>
+        <w:ind w:left="720" w:hanging="360"/>
+      </w:pPr>
+      <w:rPr>
+        <w:rFonts w:ascii="Symbol" w:hAnsi="Symbol" w:cs="Symbol" w:hint="default"/>
+      </w:rPr>
+    </w:lvl>
+    <w:lvl w:ilvl="1">
+      <w:numFmt w:val="bullet"/>
+      <w:lvlText w:val="o"/>
+      <w:lvlJc w:val="left"/>
+      <w:pPr>
+        <w:ind w:left="1440" w:hanging="360"/>
+      </w:pPr>
+      <w:rPr>
+        <w:rFonts w:ascii="Courier New" w:hAnsi="Courier New" w:cs="Courier New" w:hint="default"/>
+      </w:rPr>
+    </w:lvl>
+    <w:lvl w:ilvl="2">
+      <w:numFmt w:val="bullet"/>
+      <w:lvlText w:val=""/>
+      <w:lvlJc w:val="left"/>
+      <w:pPr>
+        <w:ind w:left="2160" w:hanging="360"/>
+      </w:pPr>
+      <w:rPr>
+        <w:rFonts w:ascii="Wingdings" w:hAnsi="Wingdings" w:cs="Wingdings" w:hint="default"/>
+      </w:rPr>
+    </w:lvl>
+    <w:lvl w:ilvl="3">
+      <w:numFmt w:val="bullet"/>
+      <w:lvlText w:val=""/>
+      <w:lvlJc w:val="left"/>
+      <w:pPr>
+        <w:ind w:left="2880" w:hanging="360"/>
+      </w:pPr>
+      <w:rPr>
+        <w:rFonts w:ascii="Symbol" w:hAnsi="Symbol" w:cs="Symbol" w:hint="default"/>
+      </w:rPr>
+    </w:lvl>
+    <w:lvl w:ilvl="4">
+      <w:numFmt w:val="bullet"/>
+      <w:lvlText w:val="o"/>
+      <w:lvlJc w:val="left"/>
+      <w:pPr>
+        <w:ind w:left="3600" w:hanging="360"/>
+      </w:pPr>
+      <w:rPr>
+        <w:rFonts w:ascii="Courier New" w:hAnsi="Courier New" w:cs="Courier New" w:hint="default"/>
+      </w:rPr>
+    </w:lvl>
+    <w:lvl w:ilvl="5">
+      <w:numFmt w:val="bullet"/>
+      <w:lvlText w:val=""/>
+      <w:lvlJc w:val="left"/>
+      <w:pPr>
+        <w:ind w:left="4320" w:hanging="360"/>
+      </w:pPr>
+      <w:rPr>
+        <w:rFonts w:ascii="Wingdings" w:hAnsi="Wingdings" w:cs="Wingdings" w:hint="default"/>
+      </w:rPr>
+    </w:lvl>
+    <w:lvl w:ilvl="6">
+      <w:numFmt w:val="bullet"/>
+      <w:lvlText w:val=""/>
+      <w:lvlJc w:val="left"/>
+      <w:pPr>
+        <w:ind w:left="5040" w:hanging="360"/>
+      </w:pPr>
+      <w:rPr>
+        <w:rFonts w:ascii="Symbol" w:hAnsi="Symbol" w:cs="Symbol" w:hint="default"/>
+      </w:rPr>
+    </w:lvl>
+    <w:lvl w:ilvl="7">
+      <w:numFmt w:val="bullet"/>
+      <w:lvlText w:val="o"/>
+      <w:lvlJc w:val="left"/>
+      <w:pPr>
+        <w:ind w:left="5760" w:hanging="360"/>
+      </w:pPr>
+      <w:rPr>
+        <w:rFonts w:ascii="Courier New" w:hAnsi="Courier New" w:cs="Courier New" w:hint="default"/>
+      </w:rPr>
+    </w:lvl>
+    <w:lvl w:ilvl="8">
+      <w:numFmt w:val="bullet"/>
+      <w:lvlText w:val=""/>
+      <w:lvlJc w:val="left"/>
+      <w:pPr>
+        <w:ind w:left="6480" w:hanging="360"/>
+      </w:pPr>
+      <w:rPr>
+        <w:rFonts w:ascii="Wingdings" w:hAnsi="Wingdings" w:cs="Wingdings" w:hint="default"/>
+      </w:rPr>
+    </w:lvl>
+  </w:abstractNum>
   <w:num w:numId="1000">
     <w:abstractNumId w:val="990"/>
+  </w:num>
+  <w:num w:numId="1001">
+    <w:abstractNumId w:val="991"/>
   </w:num>
 </w:numbering>
 </file>

</xml_diff>